<commit_message>
Add page break + title repeat for T&F two-page structure; split correspondence line
Deanon build now follows T&F layout: cover page (author → affiliation →
correspondence → ORCID) then page break then manuscript page (title
repeated → abstract → keywords → body). Anon build unaffected.

Email and ORCID split to separate paragraphs so ORCID URL doesn't wrap.

Co-Authored-By: Claude Sonnet 4.6 (1M context) <noreply@anthropic.com>
</commit_message>
<xml_diff>
--- a/03-inquiry-ai-agents/inquiry-ai-agents-2026.docx
+++ b/03-inquiry-ai-agents/inquiry-ai-agents-2026.docx
@@ -31,7 +31,28 @@
         <w:pStyle w:val="Correspondencedetails"/>
       </w:pPr>
       <w:r>
-        <w:t xml:space="preserve">Correspondence: joseph.wecker@v2.io | ORCID: https://orcid.org/0009-0004-2599-4766</w:t>
+        <w:t xml:space="preserve">Correspondence: joseph.wecker@v2.io</w:t>
+      </w:r>
+    </w:p>
+    <w:p>
+      <w:pPr>
+        <w:pStyle w:val="Correspondencedetails"/>
+      </w:pPr>
+      <w:r>
+        <w:t xml:space="preserve">ORCID: https://orcid.org/0009-0004-2599-4766</w:t>
+      </w:r>
+    </w:p>
+    <w:p>
+      <w:r>
+        <w:br w:type="page"/>
+      </w:r>
+    </w:p>
+    <w:p>
+      <w:pPr>
+        <w:pStyle w:val="Articletitle"/>
+      </w:pPr>
+      <w:r>
+        <w:t xml:space="preserve">Granted Agency Between Sovereigns: A Structural Form for Extending Agency to AI Systems</w:t>
       </w:r>
     </w:p>
     <w:p>

</xml_diff>